<commit_message>
Passo 7: "Assigned To" dos Test Cases e correcao da tag criado-por
Causa: o app nunca enviava System.AssignedTo ao criar Test Cases; com o
PAT compartilhado o Azure DevOps atribuia ao criador (dono do PAT) —
todo Test Case de qualquer usuario nascia atribuido ao administrador.
Agravante: _tag_criado_por() era chamada dentro do ThreadPoolExecutor,
onde nao existe st.session_state, e a tag saia "criado-por:desconhecido".

- create_test_case aceita assigned_to (System.AssignedTo).
- Passo 7 ganha "Atribuir os Test Cases a" (busca pessoas do projeto,
  pre-seleciona o usuario logado pelo e-mail cadastrado no app; avisa
  quando nao encontra ou quando nada foi escolhido).
- Tag e responsavel calculados na thread principal antes das threads.
- README e Guia do Usuario (docx + PDF) atualizados.

Co-Authored-By: Claude Opus 5 <noreply@anthropic.com>
</commit_message>
<xml_diff>
--- a/docs/Guia_Usuario.docx
+++ b/docs/Guia_Usuario.docx
@@ -933,6 +933,22 @@
           <w:szCs w:val="20"/>
         </w:rPr>
         <w:t xml:space="preserve">Opcionalmente, escolha uma ou mais Area Path(s) para restringir a busca.</w:t>
+      </w:r>
+    </w:p>
+    <w:p>
+      <w:pPr>
+        <w:pStyle w:val="ListParagraph"/>
+        <w:numPr>
+          <w:ilvl w:val="0"/>
+          <w:numId w:val="2"/>
+        </w:numPr>
+        <w:spacing w:after="70"/>
+      </w:pPr>
+      <w:r>
+        <w:rPr>
+          <w:sz w:val="20"/>
+        </w:rPr>
+        <w:t>Escolha em "👤 Atribuir os Test Cases a" quem fica como responsável (Assigned To) dos Casos criados. Clique em "Buscar Pessoas pra Atribuir": o app já pré-seleciona você, se o seu e-mail cadastrado no app existir no projeto do Azure DevOps. Sem essa escolha, o Azure DevOps atribui ao criador — que, com o PAT compartilhado, é sempre o administrador.</w:t>
       </w:r>
     </w:p>
     <w:p>

</xml_diff>

<commit_message>
Testes de API: geracao da bateria por IA (workflow n8n Doc_QA_ApiTest_Generation)
Nova origem "Gerar com IA" na etapa Definicao: a pessoa cola a User
Story / Work Item (ou anexa documentos em Contexto), informa a Base URL e
a IA devolve os casos ja no formato do modulo (metodo/URL/headers/body,
assercoes declarativas, extracao de variaveis) — sem Postman nem JSON
escrito a mao. Segredos nunca vao pra IA: ela declara as variaveis e a
pessoa preenche na tela.

- n8n_workflows/Doc_QA_ApiTest_Generation.json: mesmo molde do WIQL
  (Gemini -> Groq -> OpenAI -> Groq 2 -> Mistral, parser por schema,
  502 padronizado), webhook qa-testgen-apitest-generation.
- WebhookClient.trigger_api_test_generation + N8N_WEBHOOK_URL_APITEST_GENERATION.
- Conversao/validacao da resposta (metodos e tipos de assercao validos,
  status garantido, variaveis mescladas, nome sugerido).
- README, documentacao tecnica, Sobre o app e Guia do Usuario.

Co-Authored-By: Claude Opus 5 <noreply@anthropic.com>
</commit_message>
<xml_diff>
--- a/docs/Guia_Usuario.docx
+++ b/docs/Guia_Usuario.docx
@@ -1721,6 +1721,22 @@
           <w:sz w:val="20"/>
         </w:rPr>
         <w:t>De onde vêm os casos (etapa 1, "Origem dos testes"):</w:t>
+      </w:r>
+    </w:p>
+    <w:p>
+      <w:pPr>
+        <w:pStyle w:val="ListParagraph"/>
+        <w:numPr>
+          <w:ilvl w:val="0"/>
+          <w:numId w:val="3"/>
+        </w:numPr>
+        <w:spacing w:after="70"/>
+      </w:pPr>
+      <w:r>
+        <w:rPr>
+          <w:sz w:val="20"/>
+        </w:rPr>
+        <w:t>🤖 Gerar com IA: cole a User Story / descrição do Work Item (ou anexe documentos em "Contexto"), informe a Base URL e clique em "Gerar casos com IA". A bateria inteira aparece pronta no editor — sucesso, validações de campos, credenciais inválidas, regras de negócio e uso do token — e você só revisa, preenche as senhas (elas nunca vão pra IA) e executa. É a forma recomendada: não precisa de Postman nem de escrever JSON.</w:t>
       </w:r>
     </w:p>
     <w:p>

</xml_diff>

<commit_message>
Docs e textos do app alinhados a versao final dos Testes de API
- Modal de novidades e Sobre o app: caminho principal (Work Item ->
  Reconhecer a API -> Gerar com IA), chamadas pelo navegador; diagrama.
- Guia do Usuario: origem IA por Work Item + Reconhecer a API, tabela de
  variaveis travada, execucao pelo navegador, FAQ (limite da IA, CORS).
- Guia do Administrador: diagnostico de limite dos provedores.
- README: paragrafo estruturado em sub-itens; limitacao de cota da IA.
- Documentacao tecnica (12 workflows; prompt curto e motivo) e versao
  em linguagem simples; comentarios do webhook_client.
- PDFs dos guias regenerados.

Co-Authored-By: Claude Opus 5 <noreply@anthropic.com>
</commit_message>
<xml_diff>
--- a/docs/Guia_Usuario.docx
+++ b/docs/Guia_Usuario.docx
@@ -1692,7 +1692,7 @@
           <w:b w:val="0"/>
           <w:sz w:val="20"/>
         </w:rPr>
-        <w:t>2. Execução: roda os casos habilitados, na ordem, e mostra o resultado de cada asserção, com request e response já mascarados.</w:t>
+        <w:t>2. Execução: roda os casos habilitados, na ordem, e mostra o resultado de cada asserção, com request e response já mascarados. As chamadas saem do seu navegador (mesmo IP do Postman) — é o que permite testar o HML, cujo firewall bloqueia servidores em nuvem; o administrador pode mudar isso pra "Servidor do app" em Configurações.</w:t>
       </w:r>
     </w:p>
     <w:p>
@@ -1736,7 +1736,7 @@
         <w:rPr>
           <w:sz w:val="20"/>
         </w:rPr>
-        <w:t>🤖 Gerar com IA: cole a User Story / descrição do Work Item (ou anexe documentos em "Contexto"), informe a Base URL e clique em "Gerar casos com IA". A bateria inteira aparece pronta no editor — sucesso, validações de campos, credenciais inválidas, regras de negócio e uso do token — e você só revisa, preenche as senhas (elas nunca vão pra IA) e executa. É a forma recomendada: não precisa de Postman nem de escrever JSON.</w:t>
+        <w:t>🤖 Gerar com IA (forma recomendada): escolha o(s) Work Item(s) do Azure DevOps — mesma conexão de Organização/Projeto dos outros fluxos; a Descrição e os Critérios de Aceite viram a especificação — ou cole o texto / anexe documentos em "Contexto". Informe a Base URL, clique em "🔎 Reconhecer a API" (o app faz chamadas sem credencial e descobre sozinho as rotas reais, o formato dos erros e quais rotas exigem token, preenchendo as Observações) e depois em "Gerar casos com IA". A bateria inteira aparece pronta no editor — sucesso, validações, credenciais inválidas, regras de negócio e uso do token — e você só revisa, preenche as senhas (elas nunca vão pra IA) e executa. Não precisa de Postman nem de escrever JSON.</w:t>
       </w:r>
     </w:p>
     <w:p>
@@ -1798,7 +1798,7 @@
         <w:rPr>
           <w:sz w:val="20"/>
         </w:rPr>
-        <w:t>Variáveis: qualquer {{nome}} em URL, headers ou body é trocado pelo valor da tabela. Marque "Secreto" para senhas e tokens — o valor é pedido num campo de senha, fica só na sessão e sai mascarado (***MASCARADO***) de toda evidência. Cada campo secreto indica se é obrigatório (usado por algum caso habilitado) ou opcional (preenchido por extração, ou usado só por caso desabilitado). Um caso pode extrair um valor da resposta pra uma variável (ex.: data.token → auth_token) e os casos seguintes usam {{auth_token}} — por isso a ordem importa (dá pra subir/descer os casos).</w:t>
+        <w:t>Variáveis: qualquer {{nome}} em URL, headers ou body é trocado pelo valor da tabela. Nas origens IA, Postman e definição salva a tabela chega pronta — você só preenche a coluna Valor e os campos de senha (🔒) logo abaixo; nome e "Secreto" só se editam na criação manual. Cada campo secreto indica se é obrigatório (usado por algum caso habilitado) ou opcional (preenchido por extração, ex.: auth_token, ou usado só por caso desabilitado). O botão Executar avisa se alguma variável usada ficou sem valor.</w:t>
       </w:r>
     </w:p>
     <w:p>
@@ -2017,6 +2017,54 @@
           <w:sz w:val="20"/>
         </w:rPr>
         <w:t>Eles ficam na etapa 3 (Evidências). Use o seletor de etapas no topo da tela ou o botão "Próxima etapa" no fim de cada tela; na etapa 3, clique em "Gerar relatórios" e os botões de download (.md, .pdf, .zip e definição .json) aparecem logo abaixo.</w:t>
+      </w:r>
+    </w:p>
+    <w:p>
+      <w:pPr>
+        <w:pStyle w:val="Heading2"/>
+        <w:spacing w:after="100" w:before="220"/>
+      </w:pPr>
+      <w:r>
+        <w:rPr>
+          <w:b/>
+          <w:sz w:val="22"/>
+        </w:rPr>
+        <w:t>"Gerar casos com IA deu erro de limite (too many requests / rate limit)"</w:t>
+      </w:r>
+    </w:p>
+    <w:p>
+      <w:pPr>
+        <w:spacing w:after="120"/>
+      </w:pPr>
+      <w:r>
+        <w:rPr>
+          <w:sz w:val="20"/>
+        </w:rPr>
+        <w:t>Os provedores de IA têm limites por minuto e por dia; a mensagem diz qual deles recusou. Espere alguns minutos e clique de novo — a especificação e as observações continuam preenchidas. Se acontecer sempre com um documento de contexto grande, reduza o documento.</w:t>
+      </w:r>
+    </w:p>
+    <w:p>
+      <w:pPr>
+        <w:pStyle w:val="Heading2"/>
+        <w:spacing w:after="100" w:before="220"/>
+      </w:pPr>
+      <w:r>
+        <w:rPr>
+          <w:b/>
+          <w:sz w:val="22"/>
+        </w:rPr>
+        <w:t>"Nos Testes de API um caso veio com Erro: Failed to fetch"</w:t>
+      </w:r>
+    </w:p>
+    <w:p>
+      <w:pPr>
+        <w:spacing w:after="120"/>
+      </w:pPr>
+      <w:r>
+        <w:rPr>
+          <w:sz w:val="20"/>
+        </w:rPr>
+        <w:t>A API não permite chamadas a partir do navegador (CORS) — peça ao administrador para trocar o modo de execução para "Servidor do app" em Administração → Configurações, ou use outra Base URL que aceite CORS.</w:t>
       </w:r>
     </w:p>
     <w:p>

</xml_diff>